<commit_message>
TS 4.5 4.6 Kramam Tamil and Sanskrit
</commit_message>
<xml_diff>
--- a/TS-Kramam/TS-4.5/TS 4.5 Tamil Krama Paatam Corrections.docx
+++ b/TS-Kramam/TS-4.5/TS 4.5 Tamil Krama Paatam Corrections.docx
@@ -278,16 +278,16 @@
                 <w:sz w:val="28"/>
                 <w:szCs w:val="32"/>
               </w:rPr>
-              <w:t>T.S.4.5.1</w:t>
-            </w:r>
-            <w:r>
-              <w:rPr>
-                <w:rFonts w:cs="Arial"/>
-                <w:b/>
-                <w:sz w:val="28"/>
-                <w:szCs w:val="32"/>
-              </w:rPr>
-              <w:t>1</w:t>
+              <w:t>T.S.4.5.</w:t>
+            </w:r>
+            <w:r>
+              <w:rPr>
+                <w:rFonts w:cs="Arial"/>
+                <w:b/>
+                <w:sz w:val="28"/>
+                <w:szCs w:val="32"/>
+              </w:rPr>
+              <w:t>8</w:t>
             </w:r>
             <w:r>
               <w:rPr>
@@ -305,7 +305,7 @@
                 <w:sz w:val="28"/>
                 <w:szCs w:val="32"/>
               </w:rPr>
-              <w:t>1</w:t>
+              <w:t>2</w:t>
             </w:r>
             <w:r>
               <w:rPr>
@@ -391,20 +391,10 @@
                 <w:rFonts w:cs="Arial"/>
                 <w:b/>
                 <w:sz w:val="28"/>
-                <w:szCs w:val="32"/>
+                <w:szCs w:val="28"/>
                 <w:lang w:val="it-IT"/>
               </w:rPr>
-              <w:t>2</w:t>
-            </w:r>
-            <w:r>
-              <w:rPr>
-                <w:rFonts w:cs="Arial"/>
-                <w:b/>
-                <w:sz w:val="28"/>
-                <w:szCs w:val="32"/>
-                <w:lang w:val="it-IT"/>
-              </w:rPr>
-              <w:t>6</w:t>
+              <w:t>18</w:t>
             </w:r>
           </w:p>
         </w:tc>
@@ -434,7 +424,26 @@
                 <w:cs/>
                 <w:lang w:bidi="ta-IN"/>
               </w:rPr>
-              <w:t>அ</w:t>
+              <w:t>ச</w:t>
+            </w:r>
+            <w:r>
+              <w:rPr>
+                <w:rFonts w:ascii="BRH Tamil Tab Extra" w:hAnsi="BRH Tamil Tab Extra" w:cs="Latha"/>
+                <w:b/>
+                <w:sz w:val="36"/>
+                <w:szCs w:val="28"/>
+                <w:lang w:bidi="ta-IN"/>
+              </w:rPr>
+              <w:t>…</w:t>
+            </w:r>
+            <w:r>
+              <w:rPr>
+                <w:rFonts w:ascii="Latha" w:hAnsi="Latha" w:cs="Latha"/>
+                <w:sz w:val="28"/>
+                <w:szCs w:val="28"/>
+                <w:lang w:bidi="ta-IN"/>
+              </w:rPr>
+              <w:t xml:space="preserve"> </w:t>
             </w:r>
             <w:r>
               <w:rPr>
@@ -445,7 +454,17 @@
                 <w:cs/>
                 <w:lang w:bidi="ta-IN"/>
               </w:rPr>
-              <w:t>தீ</w:t>
+              <w:t>பேன்</w:t>
+            </w:r>
+            <w:r>
+              <w:rPr>
+                <w:rFonts w:ascii="Latha" w:hAnsi="Latha" w:cs="Latha"/>
+                <w:sz w:val="28"/>
+                <w:szCs w:val="28"/>
+                <w:cs/>
+                <w:lang w:bidi="ta-IN"/>
+              </w:rPr>
+              <w:t>யா</w:t>
             </w:r>
             <w:r>
               <w:rPr>
@@ -455,30 +474,47 @@
                 <w:szCs w:val="28"/>
                 <w:lang w:bidi="ta-IN"/>
               </w:rPr>
-              <w:t>…</w:t>
-            </w:r>
-            <w:r>
-              <w:rPr>
-                <w:rFonts w:ascii="Latha" w:hAnsi="Latha" w:cs="Latha"/>
-                <w:b/>
-                <w:bCs/>
-                <w:position w:val="-12"/>
-                <w:sz w:val="28"/>
-                <w:szCs w:val="28"/>
-                <w:cs/>
-                <w:lang w:bidi="ta-IN"/>
-              </w:rPr>
-              <w:t>4</w:t>
-            </w:r>
-            <w:r>
-              <w:rPr>
-                <w:rFonts w:ascii="Latha" w:hAnsi="Latha" w:cs="Latha"/>
-                <w:sz w:val="28"/>
-                <w:szCs w:val="28"/>
-                <w:cs/>
-                <w:lang w:bidi="ta-IN"/>
-              </w:rPr>
-              <w:t>த்யதி</w:t>
+              <w:t>†</w:t>
+            </w:r>
+            <w:r>
+              <w:rPr>
+                <w:rFonts w:ascii="Latha" w:hAnsi="Latha" w:cs="Latha"/>
+                <w:sz w:val="28"/>
+                <w:szCs w:val="28"/>
+                <w:cs/>
+                <w:lang w:bidi="ta-IN"/>
+              </w:rPr>
+              <w:t>ய</w:t>
+            </w:r>
+            <w:r>
+              <w:rPr>
+                <w:rFonts w:ascii="Latha" w:hAnsi="Latha" w:cs="Latha"/>
+                <w:sz w:val="28"/>
+                <w:szCs w:val="28"/>
+                <w:lang w:bidi="ta-IN"/>
+              </w:rPr>
+              <w:t xml:space="preserve"> | </w:t>
+            </w:r>
+            <w:r>
+              <w:rPr>
+                <w:rFonts w:ascii="Latha" w:hAnsi="Latha" w:cs="Latha"/>
+                <w:sz w:val="28"/>
+                <w:szCs w:val="28"/>
+                <w:highlight w:val="yellow"/>
+                <w:cs/>
+                <w:lang w:bidi="ta-IN"/>
+              </w:rPr>
+              <w:t>பேன்</w:t>
+            </w:r>
+            <w:r>
+              <w:rPr>
+                <w:rFonts w:ascii="Latha" w:hAnsi="Latha" w:cs="Latha"/>
+                <w:sz w:val="28"/>
+                <w:szCs w:val="28"/>
+                <w:cs/>
+                <w:lang w:bidi="ta-IN"/>
+              </w:rPr>
+              <w:t>யா</w:t>
             </w:r>
             <w:r>
               <w:rPr>
@@ -493,24 +529,40 @@
             <w:r>
               <w:rPr>
                 <w:rFonts w:ascii="Latha" w:hAnsi="Latha" w:cs="Latha"/>
-                <w:b/>
-                <w:bCs/>
-                <w:position w:val="-12"/>
-                <w:sz w:val="28"/>
-                <w:szCs w:val="28"/>
-                <w:cs/>
-                <w:lang w:bidi="ta-IN"/>
-              </w:rPr>
-              <w:t>4</w:t>
-            </w:r>
-            <w:r>
-              <w:rPr>
-                <w:rFonts w:ascii="Latha" w:hAnsi="Latha" w:cs="Latha"/>
-                <w:sz w:val="28"/>
-                <w:szCs w:val="28"/>
-                <w:lang w:bidi="ta-IN"/>
-              </w:rPr>
-              <w:t xml:space="preserve"> ||</w:t>
+                <w:sz w:val="28"/>
+                <w:szCs w:val="28"/>
+                <w:cs/>
+                <w:lang w:bidi="ta-IN"/>
+              </w:rPr>
+              <w:t>ய</w:t>
+            </w:r>
+            <w:r>
+              <w:rPr>
+                <w:rFonts w:ascii="Latha" w:hAnsi="Latha" w:cs="Latha"/>
+                <w:sz w:val="28"/>
+                <w:szCs w:val="28"/>
+                <w:lang w:bidi="ta-IN"/>
+              </w:rPr>
+              <w:t xml:space="preserve"> </w:t>
+            </w:r>
+            <w:r>
+              <w:rPr>
+                <w:rFonts w:ascii="Latha" w:hAnsi="Latha" w:cs="Latha"/>
+                <w:sz w:val="28"/>
+                <w:szCs w:val="28"/>
+                <w:cs/>
+                <w:lang w:bidi="ta-IN"/>
+              </w:rPr>
+              <w:t>ச</w:t>
+            </w:r>
+            <w:r>
+              <w:rPr>
+                <w:rFonts w:ascii="Latha" w:hAnsi="Latha" w:cs="Latha"/>
+                <w:sz w:val="28"/>
+                <w:szCs w:val="28"/>
+                <w:lang w:bidi="ta-IN"/>
+              </w:rPr>
+              <w:t xml:space="preserve"> |</w:t>
             </w:r>
           </w:p>
         </w:tc>
@@ -530,6 +582,492 @@
                 <w:color w:val="000000"/>
                 <w:sz w:val="40"/>
                 <w:szCs w:val="40"/>
+              </w:rPr>
+            </w:pPr>
+            <w:r>
+              <w:rPr>
+                <w:rFonts w:ascii="Latha" w:hAnsi="Latha" w:cs="Latha"/>
+                <w:sz w:val="28"/>
+                <w:szCs w:val="28"/>
+                <w:cs/>
+                <w:lang w:bidi="ta-IN"/>
+              </w:rPr>
+              <w:t>ச</w:t>
+            </w:r>
+            <w:r>
+              <w:rPr>
+                <w:rFonts w:ascii="BRH Tamil Tab Extra" w:hAnsi="BRH Tamil Tab Extra" w:cs="Latha"/>
+                <w:b/>
+                <w:sz w:val="36"/>
+                <w:szCs w:val="28"/>
+                <w:lang w:bidi="ta-IN"/>
+              </w:rPr>
+              <w:t>…</w:t>
+            </w:r>
+            <w:r>
+              <w:rPr>
+                <w:rFonts w:ascii="Latha" w:hAnsi="Latha" w:cs="Latha"/>
+                <w:sz w:val="28"/>
+                <w:szCs w:val="28"/>
+                <w:lang w:bidi="ta-IN"/>
+              </w:rPr>
+              <w:t xml:space="preserve"> </w:t>
+            </w:r>
+            <w:r>
+              <w:rPr>
+                <w:rFonts w:ascii="Latha" w:hAnsi="Latha" w:cs="Latha"/>
+                <w:sz w:val="28"/>
+                <w:szCs w:val="28"/>
+                <w:highlight w:val="green"/>
+                <w:cs/>
+                <w:lang w:bidi="ta-IN"/>
+              </w:rPr>
+              <w:t>பே</w:t>
+            </w:r>
+            <w:r>
+              <w:rPr>
+                <w:rFonts w:ascii="Latha" w:hAnsi="Latha" w:cs="Latha"/>
+                <w:b/>
+                <w:bCs/>
+                <w:position w:val="-12"/>
+                <w:szCs w:val="28"/>
+                <w:highlight w:val="green"/>
+                <w:cs/>
+                <w:lang w:bidi="ta-IN"/>
+              </w:rPr>
+              <w:t>2</w:t>
+            </w:r>
+            <w:r>
+              <w:rPr>
+                <w:rFonts w:ascii="Latha" w:hAnsi="Latha" w:cs="Latha"/>
+                <w:sz w:val="28"/>
+                <w:szCs w:val="28"/>
+                <w:highlight w:val="green"/>
+                <w:cs/>
+                <w:lang w:bidi="ta-IN"/>
+              </w:rPr>
+              <w:t>ன்</w:t>
+            </w:r>
+            <w:r>
+              <w:rPr>
+                <w:rFonts w:ascii="Latha" w:hAnsi="Latha" w:cs="Latha"/>
+                <w:sz w:val="28"/>
+                <w:szCs w:val="28"/>
+                <w:cs/>
+                <w:lang w:bidi="ta-IN"/>
+              </w:rPr>
+              <w:t>யா</w:t>
+            </w:r>
+            <w:r>
+              <w:rPr>
+                <w:rFonts w:ascii="BRH Tamil Tab Extra" w:hAnsi="BRH Tamil Tab Extra" w:cs="Latha"/>
+                <w:b/>
+                <w:sz w:val="36"/>
+                <w:szCs w:val="28"/>
+                <w:lang w:bidi="ta-IN"/>
+              </w:rPr>
+              <w:t>†</w:t>
+            </w:r>
+            <w:r>
+              <w:rPr>
+                <w:rFonts w:ascii="Latha" w:hAnsi="Latha" w:cs="Latha"/>
+                <w:sz w:val="28"/>
+                <w:szCs w:val="28"/>
+                <w:cs/>
+                <w:lang w:bidi="ta-IN"/>
+              </w:rPr>
+              <w:t>ய</w:t>
+            </w:r>
+            <w:r>
+              <w:rPr>
+                <w:rFonts w:ascii="Latha" w:hAnsi="Latha" w:cs="Latha"/>
+                <w:sz w:val="28"/>
+                <w:szCs w:val="28"/>
+                <w:lang w:bidi="ta-IN"/>
+              </w:rPr>
+              <w:t xml:space="preserve"> | </w:t>
+            </w:r>
+            <w:r>
+              <w:rPr>
+                <w:rFonts w:ascii="Latha" w:hAnsi="Latha" w:cs="Latha"/>
+                <w:sz w:val="28"/>
+                <w:szCs w:val="28"/>
+                <w:highlight w:val="green"/>
+                <w:cs/>
+                <w:lang w:bidi="ta-IN"/>
+              </w:rPr>
+              <w:t>பே</w:t>
+            </w:r>
+            <w:r>
+              <w:rPr>
+                <w:rFonts w:ascii="Latha" w:hAnsi="Latha" w:cs="Latha"/>
+                <w:b/>
+                <w:bCs/>
+                <w:position w:val="-12"/>
+                <w:szCs w:val="28"/>
+                <w:highlight w:val="green"/>
+                <w:cs/>
+                <w:lang w:bidi="ta-IN"/>
+              </w:rPr>
+              <w:t>2</w:t>
+            </w:r>
+            <w:r>
+              <w:rPr>
+                <w:rFonts w:ascii="Latha" w:hAnsi="Latha" w:cs="Latha"/>
+                <w:sz w:val="28"/>
+                <w:szCs w:val="28"/>
+                <w:highlight w:val="green"/>
+                <w:cs/>
+                <w:lang w:bidi="ta-IN"/>
+              </w:rPr>
+              <w:t>ன்</w:t>
+            </w:r>
+            <w:r>
+              <w:rPr>
+                <w:rFonts w:ascii="Latha" w:hAnsi="Latha" w:cs="Latha"/>
+                <w:sz w:val="28"/>
+                <w:szCs w:val="28"/>
+                <w:cs/>
+                <w:lang w:bidi="ta-IN"/>
+              </w:rPr>
+              <w:t>யா</w:t>
+            </w:r>
+            <w:r>
+              <w:rPr>
+                <w:rFonts w:ascii="BRH Tamil Tab Extra" w:hAnsi="BRH Tamil Tab Extra" w:cs="Latha"/>
+                <w:b/>
+                <w:sz w:val="36"/>
+                <w:szCs w:val="28"/>
+                <w:lang w:bidi="ta-IN"/>
+              </w:rPr>
+              <w:t>†</w:t>
+            </w:r>
+            <w:r>
+              <w:rPr>
+                <w:rFonts w:ascii="Latha" w:hAnsi="Latha" w:cs="Latha"/>
+                <w:sz w:val="28"/>
+                <w:szCs w:val="28"/>
+                <w:cs/>
+                <w:lang w:bidi="ta-IN"/>
+              </w:rPr>
+              <w:t>ய</w:t>
+            </w:r>
+            <w:r>
+              <w:rPr>
+                <w:rFonts w:ascii="Latha" w:hAnsi="Latha" w:cs="Latha"/>
+                <w:sz w:val="28"/>
+                <w:szCs w:val="28"/>
+                <w:lang w:bidi="ta-IN"/>
+              </w:rPr>
+              <w:t xml:space="preserve"> </w:t>
+            </w:r>
+            <w:r>
+              <w:rPr>
+                <w:rFonts w:ascii="Latha" w:hAnsi="Latha" w:cs="Latha"/>
+                <w:sz w:val="28"/>
+                <w:szCs w:val="28"/>
+                <w:cs/>
+                <w:lang w:bidi="ta-IN"/>
+              </w:rPr>
+              <w:t>ச</w:t>
+            </w:r>
+            <w:r>
+              <w:rPr>
+                <w:rFonts w:ascii="Latha" w:hAnsi="Latha" w:cs="Latha"/>
+                <w:sz w:val="28"/>
+                <w:szCs w:val="28"/>
+                <w:lang w:bidi="ta-IN"/>
+              </w:rPr>
+              <w:t xml:space="preserve"> |</w:t>
+            </w:r>
+          </w:p>
+        </w:tc>
+      </w:tr>
+      <w:tr>
+        <w:trPr>
+          <w:trHeight w:val="1118"/>
+        </w:trPr>
+        <w:tc>
+          <w:tcPr>
+            <w:tcW w:w="3906" w:type="dxa"/>
+          </w:tcPr>
+          <w:p>
+            <w:pPr>
+              <w:widowControl w:val="0"/>
+              <w:tabs>
+                <w:tab w:val="left" w:pos="993"/>
+              </w:tabs>
+              <w:autoSpaceDE w:val="0"/>
+              <w:autoSpaceDN w:val="0"/>
+              <w:adjustRightInd w:val="0"/>
+              <w:spacing w:before="0" w:line="252" w:lineRule="auto"/>
+              <w:ind w:right="297"/>
+              <w:rPr>
+                <w:rFonts w:cs="Arial"/>
+                <w:b/>
+                <w:sz w:val="28"/>
+                <w:szCs w:val="32"/>
+              </w:rPr>
+            </w:pPr>
+            <w:r>
+              <w:rPr>
+                <w:rFonts w:cs="Arial"/>
+                <w:b/>
+                <w:sz w:val="28"/>
+                <w:szCs w:val="32"/>
+              </w:rPr>
+              <w:t>T.S.4.5.1</w:t>
+            </w:r>
+            <w:r>
+              <w:rPr>
+                <w:rFonts w:cs="Arial"/>
+                <w:b/>
+                <w:sz w:val="28"/>
+                <w:szCs w:val="32"/>
+              </w:rPr>
+              <w:t>1</w:t>
+            </w:r>
+            <w:r>
+              <w:rPr>
+                <w:rFonts w:cs="Arial"/>
+                <w:b/>
+                <w:sz w:val="28"/>
+                <w:szCs w:val="32"/>
+              </w:rPr>
+              <w:t>.</w:t>
+            </w:r>
+            <w:r>
+              <w:rPr>
+                <w:rFonts w:cs="Arial"/>
+                <w:b/>
+                <w:sz w:val="28"/>
+                <w:szCs w:val="32"/>
+              </w:rPr>
+              <w:t>1</w:t>
+            </w:r>
+            <w:r>
+              <w:rPr>
+                <w:rFonts w:cs="Arial"/>
+                <w:b/>
+                <w:sz w:val="28"/>
+                <w:szCs w:val="32"/>
+              </w:rPr>
+              <w:t xml:space="preserve"> – Kramam</w:t>
+            </w:r>
+          </w:p>
+          <w:p>
+            <w:pPr>
+              <w:widowControl w:val="0"/>
+              <w:tabs>
+                <w:tab w:val="left" w:pos="993"/>
+              </w:tabs>
+              <w:autoSpaceDE w:val="0"/>
+              <w:autoSpaceDN w:val="0"/>
+              <w:adjustRightInd w:val="0"/>
+              <w:spacing w:before="0" w:line="252" w:lineRule="auto"/>
+              <w:ind w:right="297"/>
+              <w:rPr>
+                <w:rFonts w:cs="Arial"/>
+                <w:b/>
+                <w:sz w:val="28"/>
+                <w:szCs w:val="32"/>
+                <w:lang w:val="en-IN"/>
+              </w:rPr>
+            </w:pPr>
+            <w:r>
+              <w:rPr>
+                <w:rFonts w:cs="Arial"/>
+                <w:b/>
+                <w:sz w:val="28"/>
+                <w:szCs w:val="32"/>
+                <w:lang w:val="en-IN"/>
+              </w:rPr>
+              <w:t>Krama Vaakyam No.– 17</w:t>
+            </w:r>
+          </w:p>
+          <w:p>
+            <w:pPr>
+              <w:widowControl w:val="0"/>
+              <w:tabs>
+                <w:tab w:val="left" w:pos="993"/>
+              </w:tabs>
+              <w:autoSpaceDE w:val="0"/>
+              <w:autoSpaceDN w:val="0"/>
+              <w:adjustRightInd w:val="0"/>
+              <w:spacing w:before="0" w:line="252" w:lineRule="auto"/>
+              <w:ind w:right="297"/>
+              <w:rPr>
+                <w:rFonts w:cs="Arial"/>
+                <w:b/>
+                <w:sz w:val="28"/>
+                <w:szCs w:val="32"/>
+              </w:rPr>
+            </w:pPr>
+            <w:r>
+              <w:rPr>
+                <w:rFonts w:cs="Arial"/>
+                <w:b/>
+                <w:sz w:val="28"/>
+                <w:szCs w:val="32"/>
+                <w:lang w:val="it-IT"/>
+              </w:rPr>
+              <w:t>Panchaati No</w:t>
+            </w:r>
+            <w:r>
+              <w:rPr>
+                <w:rFonts w:cs="Arial"/>
+                <w:b/>
+                <w:szCs w:val="32"/>
+                <w:lang w:val="it-IT"/>
+              </w:rPr>
+              <w:t xml:space="preserve">. - </w:t>
+            </w:r>
+            <w:r>
+              <w:rPr>
+                <w:rFonts w:cs="Arial"/>
+                <w:b/>
+                <w:sz w:val="28"/>
+                <w:szCs w:val="32"/>
+                <w:lang w:val="it-IT"/>
+              </w:rPr>
+              <w:t>2</w:t>
+            </w:r>
+            <w:r>
+              <w:rPr>
+                <w:rFonts w:cs="Arial"/>
+                <w:b/>
+                <w:sz w:val="28"/>
+                <w:szCs w:val="32"/>
+                <w:lang w:val="it-IT"/>
+              </w:rPr>
+              <w:t>6</w:t>
+            </w:r>
+          </w:p>
+        </w:tc>
+        <w:tc>
+          <w:tcPr>
+            <w:tcW w:w="5103" w:type="dxa"/>
+          </w:tcPr>
+          <w:p>
+            <w:pPr>
+              <w:widowControl w:val="0"/>
+              <w:autoSpaceDE w:val="0"/>
+              <w:autoSpaceDN w:val="0"/>
+              <w:adjustRightInd w:val="0"/>
+              <w:spacing w:before="0" w:line="240" w:lineRule="auto"/>
+              <w:rPr>
+                <w:rFonts w:ascii="Latha" w:hAnsi="Latha" w:cs="Latha"/>
+                <w:sz w:val="28"/>
+                <w:szCs w:val="28"/>
+                <w:cs/>
+                <w:lang w:bidi="ta-IN"/>
+              </w:rPr>
+            </w:pPr>
+            <w:r>
+              <w:rPr>
+                <w:rFonts w:ascii="Latha" w:hAnsi="Latha" w:cs="Latha"/>
+                <w:sz w:val="28"/>
+                <w:szCs w:val="28"/>
+                <w:cs/>
+                <w:lang w:bidi="ta-IN"/>
+              </w:rPr>
+              <w:t>அ</w:t>
+            </w:r>
+            <w:r>
+              <w:rPr>
+                <w:rFonts w:ascii="Latha" w:hAnsi="Latha" w:cs="Latha"/>
+                <w:sz w:val="28"/>
+                <w:szCs w:val="28"/>
+                <w:highlight w:val="yellow"/>
+                <w:cs/>
+                <w:lang w:bidi="ta-IN"/>
+              </w:rPr>
+              <w:t>தீ</w:t>
+            </w:r>
+            <w:r>
+              <w:rPr>
+                <w:rFonts w:ascii="BRH Tamil Tab Extra" w:hAnsi="BRH Tamil Tab Extra" w:cs="Latha"/>
+                <w:b/>
+                <w:sz w:val="36"/>
+                <w:szCs w:val="28"/>
+                <w:lang w:bidi="ta-IN"/>
+              </w:rPr>
+              <w:t>…</w:t>
+            </w:r>
+            <w:r>
+              <w:rPr>
+                <w:rFonts w:ascii="Latha" w:hAnsi="Latha" w:cs="Latha"/>
+                <w:b/>
+                <w:bCs/>
+                <w:position w:val="-12"/>
+                <w:sz w:val="28"/>
+                <w:szCs w:val="28"/>
+                <w:cs/>
+                <w:lang w:bidi="ta-IN"/>
+              </w:rPr>
+              <w:t>4</w:t>
+            </w:r>
+            <w:r>
+              <w:rPr>
+                <w:rFonts w:ascii="Latha" w:hAnsi="Latha" w:cs="Latha"/>
+                <w:sz w:val="28"/>
+                <w:szCs w:val="28"/>
+                <w:cs/>
+                <w:lang w:bidi="ta-IN"/>
+              </w:rPr>
+              <w:t>த்யதி</w:t>
+            </w:r>
+            <w:r>
+              <w:rPr>
+                <w:rFonts w:ascii="BRH Tamil Tab Extra" w:hAnsi="BRH Tamil Tab Extra" w:cs="Latha"/>
+                <w:b/>
+                <w:sz w:val="36"/>
+                <w:szCs w:val="28"/>
+                <w:lang w:bidi="ta-IN"/>
+              </w:rPr>
+              <w:t>†</w:t>
+            </w:r>
+            <w:r>
+              <w:rPr>
+                <w:rFonts w:ascii="Latha" w:hAnsi="Latha" w:cs="Latha"/>
+                <w:b/>
+                <w:bCs/>
+                <w:position w:val="-12"/>
+                <w:sz w:val="28"/>
+                <w:szCs w:val="28"/>
+                <w:cs/>
+                <w:lang w:bidi="ta-IN"/>
+              </w:rPr>
+              <w:t>4</w:t>
+            </w:r>
+            <w:r>
+              <w:rPr>
+                <w:rFonts w:ascii="Latha" w:hAnsi="Latha" w:cs="Latha"/>
+                <w:sz w:val="28"/>
+                <w:szCs w:val="28"/>
+                <w:lang w:bidi="ta-IN"/>
+              </w:rPr>
+              <w:t xml:space="preserve"> ||</w:t>
+            </w:r>
+          </w:p>
+        </w:tc>
+        <w:tc>
+          <w:tcPr>
+            <w:tcW w:w="5386" w:type="dxa"/>
+          </w:tcPr>
+          <w:p>
+            <w:pPr>
+              <w:widowControl w:val="0"/>
+              <w:autoSpaceDE w:val="0"/>
+              <w:autoSpaceDN w:val="0"/>
+              <w:adjustRightInd w:val="0"/>
+              <w:spacing w:before="0" w:line="240" w:lineRule="auto"/>
+              <w:rPr>
+                <w:rFonts w:ascii="Latha" w:hAnsi="Latha" w:cs="Latha"/>
+                <w:sz w:val="28"/>
+                <w:szCs w:val="28"/>
+                <w:cs/>
+                <w:lang w:bidi="ta-IN"/>
               </w:rPr>
             </w:pPr>
             <w:r>
@@ -1747,7 +2285,6 @@
           <w:szCs w:val="32"/>
           <w:u w:val="single"/>
         </w:rPr>
-        <w:lastRenderedPageBreak/>
         <w:t xml:space="preserve">TS </w:t>
       </w:r>
       <w:r>
@@ -4340,7 +4877,6 @@
           <w:szCs w:val="32"/>
           <w:u w:val="single"/>
         </w:rPr>
-        <w:lastRenderedPageBreak/>
         <w:t xml:space="preserve">TS </w:t>
       </w:r>
       <w:r>
@@ -5638,7 +6174,7 @@
   <w:style w:type="paragraph" w:default="1" w:styleId="Normal">
     <w:name w:val="Normal"/>
     <w:qFormat/>
-    <w:rsid w:val="00076C05"/>
+    <w:rsid w:val="00774752"/>
     <w:pPr>
       <w:spacing w:before="120" w:line="276" w:lineRule="auto"/>
     </w:pPr>

</xml_diff>